<commit_message>
Update abdomen-pelvis renal urinary and anorectal content
</commit_message>
<xml_diff>
--- a/www/content/abdomen-pelvis/Anorectum.docx
+++ b/www/content/abdomen-pelvis/Anorectum.docx
@@ -33,6 +33,17 @@
       </w:r>
     </w:p>
     <w:p>
+      <w:r>
+        <w:t>[HTML]</w:t>
+      </w:r>
+      <w:r>
+        <w:t xml:space="preserve"> </w:t>
+      </w:r>
+      <w:r>
+        <w:t>anorectum.html</w:t>
+      </w:r>
+    </w:p>
+    <w:p>
       <w:pPr>
         <w:pStyle w:val="Heading3"/>
       </w:pPr>
@@ -48,13 +59,7 @@
         </w:numPr>
       </w:pPr>
       <w:r>
-        <w:t xml:space="preserve">Junction </w:t>
-      </w:r>
-      <w:r>
-        <w:t>opposite</w:t>
-      </w:r>
-      <w:r>
-        <w:t xml:space="preserve"> to left sacroiliac joint</w:t>
+        <w:t>Junction opposite to left sacroiliac joint</w:t>
       </w:r>
     </w:p>
     <w:p>
@@ -236,13 +241,23 @@
         <w:t>natomical anal canal + distal 2 cm of rectum above pectinate line</w:t>
       </w:r>
     </w:p>
-    <w:p/>
+    <w:p>
+      <w:r>
+        <w:lastRenderedPageBreak/>
+        <w:t>[HTML]</w:t>
+      </w:r>
+      <w:r>
+        <w:t xml:space="preserve"> </w:t>
+      </w:r>
+      <w:r>
+        <w:t>anorectumperitonealreflection.html</w:t>
+      </w:r>
+    </w:p>
     <w:p>
       <w:pPr>
         <w:pStyle w:val="Heading2"/>
       </w:pPr>
       <w:r>
-        <w:lastRenderedPageBreak/>
         <w:t>4 and its multiples</w:t>
       </w:r>
     </w:p>
@@ -360,17 +375,41 @@
     </w:p>
     <w:p>
       <w:r>
-        <w:t>Upper third - covered all three sides by peritoneum</w:t>
-      </w:r>
-    </w:p>
-    <w:p>
-      <w:r>
-        <w:t>Middle third - anterior peritoneal covering</w:t>
-      </w:r>
-    </w:p>
-    <w:p>
-      <w:r>
-        <w:t>Lower third - No peritoneal covering</w:t>
+        <w:rPr>
+          <w:b/>
+          <w:bCs/>
+          <w:color w:val="156082" w:themeColor="accent1"/>
+        </w:rPr>
+        <w:t>Upper third</w:t>
+      </w:r>
+      <w:r>
+        <w:t xml:space="preserve"> - covered all three sides by peritoneum</w:t>
+      </w:r>
+    </w:p>
+    <w:p>
+      <w:r>
+        <w:rPr>
+          <w:b/>
+          <w:bCs/>
+          <w:color w:val="156082" w:themeColor="accent1"/>
+        </w:rPr>
+        <w:t>Middle third</w:t>
+      </w:r>
+      <w:r>
+        <w:t xml:space="preserve"> - anterior peritoneal covering</w:t>
+      </w:r>
+    </w:p>
+    <w:p>
+      <w:r>
+        <w:rPr>
+          <w:b/>
+          <w:bCs/>
+          <w:color w:val="156082" w:themeColor="accent1"/>
+        </w:rPr>
+        <w:t>Lower third</w:t>
+      </w:r>
+      <w:r>
+        <w:t xml:space="preserve"> - No peritoneal covering</w:t>
       </w:r>
     </w:p>
     <w:p>
@@ -411,6 +450,17 @@
       </w:r>
     </w:p>
     <w:p>
+      <w:r>
+        <w:t>[HTML]</w:t>
+      </w:r>
+      <w:r>
+        <w:t xml:space="preserve"> </w:t>
+      </w:r>
+      <w:r>
+        <w:t>malepelvis.html</w:t>
+      </w:r>
+    </w:p>
+    <w:p>
       <w:pPr>
         <w:pStyle w:val="Heading2"/>
       </w:pPr>
@@ -434,6 +484,7 @@
     </w:p>
     <w:p>
       <w:r>
+        <w:lastRenderedPageBreak/>
         <w:t>Anterior: posterior vaginal wall</w:t>
       </w:r>
     </w:p>
@@ -450,67 +501,170 @@
     </w:p>
     <w:p>
       <w:r>
+        <w:t xml:space="preserve">Intraperitoneal </w:t>
+      </w:r>
+    </w:p>
+    <w:p>
+      <w:r>
+        <w:t>Anterior: posterior vaginal wall, upper uterus, uterine (fallopian) tubes, ovaries</w:t>
+      </w:r>
+    </w:p>
+    <w:p>
+      <w:r>
+        <w:t>Lateral: pelvic wall</w:t>
+      </w:r>
+    </w:p>
+    <w:p>
+      <w:r>
+        <w:t>Posterior: as in the male</w:t>
+      </w:r>
+    </w:p>
+    <w:p>
+      <w:r>
+        <w:t>[HTML]</w:t>
+      </w:r>
+      <w:r>
+        <w:t xml:space="preserve"> </w:t>
+      </w:r>
+      <w:r>
+        <w:t>femalepelvis.html</w:t>
+      </w:r>
+    </w:p>
+    <w:p>
+      <w:pPr>
+        <w:pStyle w:val="Heading2"/>
+      </w:pPr>
+      <w:r>
+        <w:t>Interior of rectum</w:t>
+      </w:r>
+    </w:p>
+    <w:p>
+      <w:r>
+        <w:t>Four transverse mucosal folds - inconsistent</w:t>
+      </w:r>
+    </w:p>
+    <w:p>
+      <w:r>
+        <w:t>First and third - towards left </w:t>
+      </w:r>
+    </w:p>
+    <w:p>
+      <w:r>
+        <w:t>Second and fourth - towards right </w:t>
+      </w:r>
+    </w:p>
+    <w:p>
+      <w:pPr>
+        <w:pStyle w:val="Heading2"/>
+      </w:pPr>
+      <w:r>
+        <w:t>Surgical anal canal</w:t>
+      </w:r>
+    </w:p>
+    <w:p>
+      <w:r>
+        <w:t>Definition - anal canal + 2 cm of distal rectum above the pectinate line</w:t>
+      </w:r>
+    </w:p>
+    <w:p>
+      <w:pPr>
+        <w:pStyle w:val="Heading2"/>
+      </w:pPr>
+      <w:r>
+        <w:t>Interior of anal canal</w:t>
+      </w:r>
+    </w:p>
+    <w:p>
+      <w:pPr>
+        <w:pStyle w:val="Heading3"/>
+      </w:pPr>
+      <w:r>
+        <w:t>Anal columns of Morgagni</w:t>
+      </w:r>
+    </w:p>
+    <w:p>
+      <w:r>
+        <w:t xml:space="preserve">Permanent mucosal folds with underlying parallel bundles of muscularis </w:t>
+      </w:r>
+    </w:p>
+    <w:p>
+      <w:pPr>
+        <w:pStyle w:val="Heading3"/>
+      </w:pPr>
+      <w:r>
+        <w:t xml:space="preserve">Anal valves </w:t>
+      </w:r>
+    </w:p>
+    <w:p>
+      <w:r>
+        <w:t>Crescent shaped folds connecting lower ends of anal columns</w:t>
+      </w:r>
+    </w:p>
+    <w:p>
+      <w:r>
+        <w:t>[TIP]</w:t>
+      </w:r>
+      <w:r>
+        <w:t xml:space="preserve">Pectinate line (dentate line) is the position of anal valves </w:t>
+      </w:r>
+    </w:p>
+    <w:p>
+      <w:pPr>
+        <w:pStyle w:val="Heading3"/>
+      </w:pPr>
+      <w:r>
+        <w:t>Anal sinuses or anal crypts</w:t>
+      </w:r>
+    </w:p>
+    <w:p>
+      <w:r>
+        <w:t xml:space="preserve">Pockets formed by the anal valves </w:t>
+      </w:r>
+    </w:p>
+    <w:p>
+      <w:pPr>
+        <w:pStyle w:val="Heading3"/>
+      </w:pPr>
+      <w:r>
+        <w:t xml:space="preserve">Anal ducts </w:t>
+      </w:r>
+    </w:p>
+    <w:p>
+      <w:r>
+        <w:t>Downward and outward running small ducts from anal sinuses on the posterior rectal wall</w:t>
+      </w:r>
+    </w:p>
+    <w:p>
+      <w:pPr>
+        <w:pStyle w:val="Heading3"/>
+      </w:pPr>
+      <w:r>
+        <w:t xml:space="preserve">Anal papillae </w:t>
+      </w:r>
+    </w:p>
+    <w:p>
+      <w:r>
+        <w:t>Mucosal projections from the junction of anal valves and the anal columns</w:t>
+      </w:r>
+    </w:p>
+    <w:p>
+      <w:r>
+        <w:t>[HTML]</w:t>
+      </w:r>
+      <w:r>
+        <w:t xml:space="preserve"> </w:t>
+      </w:r>
+      <w:r>
+        <w:t>analinterior.html</w:t>
+      </w:r>
+    </w:p>
+    <w:p>
+      <w:pPr>
+        <w:pStyle w:val="Heading2"/>
+      </w:pPr>
+      <w:r>
         <w:lastRenderedPageBreak/>
-        <w:t xml:space="preserve">Intraperitoneal </w:t>
-      </w:r>
-    </w:p>
-    <w:p>
-      <w:r>
-        <w:t>Anterior: posterior vaginal wall, upper uterus, uterine (fallopian) tubes, ovaries</w:t>
-      </w:r>
-    </w:p>
-    <w:p>
-      <w:r>
-        <w:t>Lateral: pelvic wall</w:t>
-      </w:r>
-    </w:p>
-    <w:p>
-      <w:r>
-        <w:t>Posterior: as in the male</w:t>
-      </w:r>
-    </w:p>
-    <w:p>
-      <w:pPr>
-        <w:pStyle w:val="Heading2"/>
-      </w:pPr>
-      <w:r>
-        <w:t>Interior of rectum</w:t>
-      </w:r>
-    </w:p>
-    <w:p>
-      <w:r>
-        <w:t>Four transverse mucosal folds - inconsistent</w:t>
-      </w:r>
-    </w:p>
-    <w:p>
-      <w:r>
-        <w:t>First and third - towards left </w:t>
-      </w:r>
-    </w:p>
-    <w:p>
-      <w:r>
-        <w:t>Second and fourth - towards right </w:t>
-      </w:r>
-    </w:p>
-    <w:p>
-      <w:pPr>
-        <w:pStyle w:val="Heading2"/>
-      </w:pPr>
-      <w:r>
-        <w:t>Surgical anal canal</w:t>
-      </w:r>
-    </w:p>
-    <w:p>
-      <w:r>
-        <w:t>Definition - anal canal + 2 cm of distal rectum above the pectinate line</w:t>
-      </w:r>
-    </w:p>
-    <w:p>
-      <w:pPr>
-        <w:pStyle w:val="Heading2"/>
-      </w:pPr>
-      <w:r>
-        <w:t>Interior of anal canal</w:t>
+        <w:t>Pectinate line, dentate line, Hilton's line and mucocutaneous line</w:t>
       </w:r>
     </w:p>
     <w:p>
@@ -518,12 +672,12 @@
         <w:pStyle w:val="Heading3"/>
       </w:pPr>
       <w:r>
-        <w:t>Anal columns of Morgagni</w:t>
-      </w:r>
-    </w:p>
-    <w:p>
-      <w:r>
-        <w:t xml:space="preserve">Permanent mucosal folds with underlying parallel bundles of muscularis </w:t>
+        <w:t>Pectinate line = dentate line</w:t>
+      </w:r>
+    </w:p>
+    <w:p>
+      <w:r>
+        <w:t>Formed by the margins of anal valves</w:t>
       </w:r>
     </w:p>
     <w:p>
@@ -531,86 +685,6 @@
         <w:pStyle w:val="Heading3"/>
       </w:pPr>
       <w:r>
-        <w:t xml:space="preserve">Anal valves </w:t>
-      </w:r>
-    </w:p>
-    <w:p>
-      <w:r>
-        <w:t>Crescent shaped folds connecting lower ends of anal columns</w:t>
-      </w:r>
-    </w:p>
-    <w:p>
-      <w:r>
-        <w:t xml:space="preserve">Pectinate line (dentate line) is the position of anal valves </w:t>
-      </w:r>
-    </w:p>
-    <w:p>
-      <w:pPr>
-        <w:pStyle w:val="Heading3"/>
-      </w:pPr>
-      <w:r>
-        <w:t>Anal sinuses or anal crypts</w:t>
-      </w:r>
-    </w:p>
-    <w:p>
-      <w:r>
-        <w:t xml:space="preserve">Pockets formed by the anal valves </w:t>
-      </w:r>
-    </w:p>
-    <w:p>
-      <w:pPr>
-        <w:pStyle w:val="Heading3"/>
-      </w:pPr>
-      <w:r>
-        <w:t xml:space="preserve">Anal ducts </w:t>
-      </w:r>
-    </w:p>
-    <w:p>
-      <w:r>
-        <w:t>Downward and outward running small ducts from anal sinuses on the posterior rectal wall</w:t>
-      </w:r>
-    </w:p>
-    <w:p>
-      <w:pPr>
-        <w:pStyle w:val="Heading3"/>
-      </w:pPr>
-      <w:r>
-        <w:t xml:space="preserve">Anal papillae </w:t>
-      </w:r>
-    </w:p>
-    <w:p>
-      <w:r>
-        <w:t>Mucosal projections from the junction of anal valves and the anal columns</w:t>
-      </w:r>
-    </w:p>
-    <w:p/>
-    <w:p>
-      <w:pPr>
-        <w:pStyle w:val="Heading2"/>
-      </w:pPr>
-      <w:r>
-        <w:t>Pectinate line, dentate line, Hilton's line and mucocutaneous line</w:t>
-      </w:r>
-    </w:p>
-    <w:p>
-      <w:pPr>
-        <w:pStyle w:val="Heading3"/>
-      </w:pPr>
-      <w:r>
-        <w:t>Pectinate line = dentate line</w:t>
-      </w:r>
-    </w:p>
-    <w:p>
-      <w:r>
-        <w:t>Formed by the margins of anal valves</w:t>
-      </w:r>
-    </w:p>
-    <w:p>
-      <w:pPr>
-        <w:pStyle w:val="Heading3"/>
-      </w:pPr>
-      <w:r>
-        <w:lastRenderedPageBreak/>
         <w:t xml:space="preserve">Hilton's line = Mucocutaneous line </w:t>
       </w:r>
     </w:p>
@@ -619,13 +693,15 @@
         <w:t>Mucocutaneous junction of stratified squamous and columnar epithelium</w:t>
       </w:r>
     </w:p>
-    <w:p/>
-    <w:p>
-      <w:pPr>
-        <w:pStyle w:val="Heading2"/>
-      </w:pPr>
-      <w:r>
-        <w:t>Table</w:t>
+    <w:p>
+      <w:r>
+        <w:t>[HTML]</w:t>
+      </w:r>
+      <w:r>
+        <w:t xml:space="preserve"> </w:t>
+      </w:r>
+      <w:r>
+        <w:t>pectinate1.html</w:t>
       </w:r>
     </w:p>
     <w:p>
@@ -932,13 +1008,7 @@
           </w:tcPr>
           <w:p>
             <w:r>
-              <w:t xml:space="preserve">Good </w:t>
-            </w:r>
-            <w:r>
-              <w:t>localization</w:t>
-            </w:r>
-            <w:r>
-              <w:t xml:space="preserve"> of sensations</w:t>
+              <w:t>Good localization of sensations</w:t>
             </w:r>
           </w:p>
         </w:tc>
@@ -1002,13 +1072,8 @@
           </w:tcPr>
           <w:p>
             <w:r>
-              <w:t xml:space="preserve">External </w:t>
+              <w:t>External hemorrhoids</w:t>
             </w:r>
-            <w:proofErr w:type="spellStart"/>
-            <w:r>
-              <w:t>hemorrhoids</w:t>
-            </w:r>
-            <w:proofErr w:type="spellEnd"/>
           </w:p>
         </w:tc>
         <w:tc>
@@ -1017,21 +1082,226 @@
           </w:tcPr>
           <w:p>
             <w:r>
-              <w:t xml:space="preserve">Internal </w:t>
+              <w:t>Internal hemorrhoids</w:t>
             </w:r>
-            <w:proofErr w:type="spellStart"/>
-            <w:r>
-              <w:t>hemorrhoids</w:t>
-            </w:r>
-            <w:proofErr w:type="spellEnd"/>
           </w:p>
         </w:tc>
       </w:tr>
     </w:tbl>
     <w:p/>
-    <w:p/>
-    <w:p/>
-    <w:p/>
+    <w:p>
+      <w:r>
+        <w:t>____MCQ_START____</w:t>
+      </w:r>
+    </w:p>
+    <w:p>
+      <w:r>
+        <w:t>Q1. The anorectum begins at:</w:t>
+      </w:r>
+      <w:r>
+        <w:br/>
+        <w:t>A. L5 vertebral level</w:t>
+      </w:r>
+      <w:r>
+        <w:br/>
+        <w:t>B. S1 vertebral level</w:t>
+      </w:r>
+      <w:r>
+        <w:br/>
+        <w:t xml:space="preserve">C. S3 vertebral </w:t>
+      </w:r>
+      <w:proofErr w:type="gramStart"/>
+      <w:r>
+        <w:t>level[</w:t>
+      </w:r>
+      <w:proofErr w:type="gramEnd"/>
+      <w:r>
+        <w:t>CORRECT]</w:t>
+      </w:r>
+      <w:r>
+        <w:br/>
+        <w:t>D. Coccyx</w:t>
+      </w:r>
+    </w:p>
+    <w:p>
+      <w:r>
+        <w:t>____</w:t>
+      </w:r>
+    </w:p>
+    <w:p>
+      <w:r>
+        <w:t>Q2. The surgical anal canal is defined as:</w:t>
+      </w:r>
+      <w:r>
+        <w:br/>
+        <w:t>A. Only the anatomical anal canal</w:t>
+      </w:r>
+      <w:r>
+        <w:br/>
+        <w:t>B. Distal rectum only</w:t>
+      </w:r>
+      <w:r>
+        <w:br/>
+        <w:t xml:space="preserve">C. Anal canal plus distal 2 cm of rectum above pectinate </w:t>
+      </w:r>
+      <w:proofErr w:type="gramStart"/>
+      <w:r>
+        <w:t>line[</w:t>
+      </w:r>
+      <w:proofErr w:type="gramEnd"/>
+      <w:r>
+        <w:t>CORRECT]</w:t>
+      </w:r>
+      <w:r>
+        <w:br/>
+        <w:t>D. Entire rectum</w:t>
+      </w:r>
+    </w:p>
+    <w:p>
+      <w:r>
+        <w:t>____</w:t>
+      </w:r>
+    </w:p>
+    <w:p>
+      <w:r>
+        <w:lastRenderedPageBreak/>
+        <w:t>Q3. The perineal curvature of the rectum is:</w:t>
+      </w:r>
+      <w:r>
+        <w:br/>
+        <w:t>A. Concave anteriorly</w:t>
+      </w:r>
+      <w:r>
+        <w:br/>
+        <w:t xml:space="preserve">B. Convex anteriorly due to </w:t>
+      </w:r>
+      <w:proofErr w:type="gramStart"/>
+      <w:r>
+        <w:t>puborectalis[</w:t>
+      </w:r>
+      <w:proofErr w:type="gramEnd"/>
+      <w:r>
+        <w:t>CORRECT]</w:t>
+      </w:r>
+      <w:r>
+        <w:br/>
+        <w:t>C. Straight</w:t>
+      </w:r>
+      <w:r>
+        <w:br/>
+        <w:t>D. Concave posteriorly</w:t>
+      </w:r>
+    </w:p>
+    <w:p>
+      <w:r>
+        <w:t>____</w:t>
+      </w:r>
+    </w:p>
+    <w:p>
+      <w:r>
+        <w:t>Q4. The pectinate line is formed by:</w:t>
+      </w:r>
+      <w:r>
+        <w:br/>
+        <w:t>A. Anal papillae</w:t>
+      </w:r>
+      <w:r>
+        <w:br/>
+        <w:t>B. Anal columns</w:t>
+      </w:r>
+      <w:r>
+        <w:br/>
+        <w:t xml:space="preserve">C. Anal </w:t>
+      </w:r>
+      <w:proofErr w:type="gramStart"/>
+      <w:r>
+        <w:t>valves[</w:t>
+      </w:r>
+      <w:proofErr w:type="gramEnd"/>
+      <w:r>
+        <w:t>CORRECT]</w:t>
+      </w:r>
+      <w:r>
+        <w:br/>
+        <w:t>D. Anal sinuses</w:t>
+      </w:r>
+    </w:p>
+    <w:p>
+      <w:r>
+        <w:t>____</w:t>
+      </w:r>
+    </w:p>
+    <w:p>
+      <w:r>
+        <w:t>Q5. Below the pectinate line, the epithelium is:</w:t>
+      </w:r>
+      <w:r>
+        <w:br/>
+        <w:t>A. Simple columnar</w:t>
+      </w:r>
+      <w:r>
+        <w:br/>
+        <w:t>B. Transitional</w:t>
+      </w:r>
+      <w:r>
+        <w:br/>
+        <w:t xml:space="preserve">C. Stratified </w:t>
+      </w:r>
+      <w:proofErr w:type="gramStart"/>
+      <w:r>
+        <w:t>squamous[</w:t>
+      </w:r>
+      <w:proofErr w:type="gramEnd"/>
+      <w:r>
+        <w:t>CORRECT]</w:t>
+      </w:r>
+      <w:r>
+        <w:br/>
+        <w:t>D. Cuboidal</w:t>
+      </w:r>
+    </w:p>
+    <w:p>
+      <w:r>
+        <w:t>____</w:t>
+      </w:r>
+    </w:p>
+    <w:p>
+      <w:r>
+        <w:t>Q6. Internal hemorrhoids occur:</w:t>
+      </w:r>
+      <w:r>
+        <w:br/>
+        <w:t>A. Below pectinate line</w:t>
+      </w:r>
+      <w:r>
+        <w:br/>
+        <w:t xml:space="preserve">B. Above pectinate </w:t>
+      </w:r>
+      <w:proofErr w:type="gramStart"/>
+      <w:r>
+        <w:t>line[</w:t>
+      </w:r>
+      <w:proofErr w:type="gramEnd"/>
+      <w:r>
+        <w:t>CORRECT]</w:t>
+      </w:r>
+      <w:r>
+        <w:br/>
+        <w:t>C. At mucocutaneous junction</w:t>
+      </w:r>
+      <w:r>
+        <w:br/>
+        <w:t>D. In rectosigmoid junction</w:t>
+      </w:r>
+    </w:p>
+    <w:p>
+      <w:r>
+        <w:t>____</w:t>
+      </w:r>
+      <w:r>
+        <w:t>MCQ_END____</w:t>
+      </w:r>
+    </w:p>
     <w:p/>
     <w:sectPr>
       <w:pgSz w:w="11906" w:h="16838"/>

</xml_diff>

<commit_message>
Update abdomen-pelvis content with latest HTML generation and fixes
</commit_message>
<xml_diff>
--- a/www/content/abdomen-pelvis/Anorectum.docx
+++ b/www/content/abdomen-pelvis/Anorectum.docx
@@ -40,7 +40,16 @@
         <w:t xml:space="preserve"> </w:t>
       </w:r>
       <w:r>
-        <w:t>anorectum.html</w:t>
+        <w:t>levels</w:t>
+      </w:r>
+      <w:r>
+        <w:t>anorectum1</w:t>
+      </w:r>
+      <w:r>
+        <w:t>.html</w:t>
+      </w:r>
+      <w:r>
+        <w:t>[/HTML]</w:t>
       </w:r>
     </w:p>
     <w:p>
@@ -100,23 +109,7 @@
         </w:numPr>
       </w:pPr>
       <w:r>
-        <w:t xml:space="preserve">The level at which appendices </w:t>
-      </w:r>
-      <w:proofErr w:type="spellStart"/>
-      <w:r>
-        <w:t>epiploicea</w:t>
-      </w:r>
-      <w:proofErr w:type="spellEnd"/>
-      <w:r>
-        <w:t xml:space="preserve"> and </w:t>
-      </w:r>
-      <w:proofErr w:type="spellStart"/>
-      <w:r>
-        <w:t>sacculations</w:t>
-      </w:r>
-      <w:proofErr w:type="spellEnd"/>
-      <w:r>
-        <w:t xml:space="preserve"> of sigmoid colon disappears</w:t>
+        <w:t>The level at which appendices epiploicea and sacculations of sigmoid colon disappears</w:t>
       </w:r>
     </w:p>
     <w:p>
@@ -247,10 +240,7 @@
         <w:t>[HTML]</w:t>
       </w:r>
       <w:r>
-        <w:t xml:space="preserve"> </w:t>
-      </w:r>
-      <w:r>
-        <w:t>anorectumperitonealreflection.html</w:t>
+        <w:t xml:space="preserve"> anorectumperitonealreflection.html</w:t>
       </w:r>
     </w:p>
     <w:p>
@@ -451,13 +441,25 @@
     </w:p>
     <w:p>
       <w:r>
-        <w:t>[HTML]</w:t>
+        <w:t>[</w:t>
+      </w:r>
+      <w:r>
+        <w:t>SVG</w:t>
+      </w:r>
+      <w:r>
+        <w:t>]</w:t>
+      </w:r>
+      <w:r>
+        <w:t xml:space="preserve"> male</w:t>
       </w:r>
       <w:r>
         <w:t xml:space="preserve"> </w:t>
       </w:r>
       <w:r>
-        <w:t>malepelvis.html</w:t>
+        <w:t>pelvis.</w:t>
+      </w:r>
+      <w:r>
+        <w:t>SVG</w:t>
       </w:r>
     </w:p>
     <w:p>
@@ -521,141 +523,150 @@
     </w:p>
     <w:p>
       <w:r>
+        <w:t>[</w:t>
+      </w:r>
+      <w:r>
+        <w:t>SVG</w:t>
+      </w:r>
+      <w:r>
+        <w:t>]</w:t>
+      </w:r>
+      <w:r>
+        <w:t xml:space="preserve"> female</w:t>
+      </w:r>
+      <w:r>
+        <w:t xml:space="preserve"> </w:t>
+      </w:r>
+      <w:r>
+        <w:t>pelvis.</w:t>
+      </w:r>
+      <w:r>
+        <w:t>svg</w:t>
+      </w:r>
+    </w:p>
+    <w:p>
+      <w:pPr>
+        <w:pStyle w:val="Heading2"/>
+      </w:pPr>
+      <w:r>
+        <w:t>Interior of rectum</w:t>
+      </w:r>
+    </w:p>
+    <w:p>
+      <w:r>
+        <w:t>Four transverse mucosal folds - inconsistent</w:t>
+      </w:r>
+    </w:p>
+    <w:p>
+      <w:r>
+        <w:t>First and third - towards left </w:t>
+      </w:r>
+    </w:p>
+    <w:p>
+      <w:r>
+        <w:t>Second and fourth - towards right </w:t>
+      </w:r>
+    </w:p>
+    <w:p>
+      <w:pPr>
+        <w:pStyle w:val="Heading2"/>
+      </w:pPr>
+      <w:r>
+        <w:t>Surgical anal canal</w:t>
+      </w:r>
+    </w:p>
+    <w:p>
+      <w:r>
+        <w:t>Definition - anal canal + 2 cm of distal rectum above the pectinate line</w:t>
+      </w:r>
+    </w:p>
+    <w:p>
+      <w:pPr>
+        <w:pStyle w:val="Heading2"/>
+      </w:pPr>
+      <w:r>
+        <w:t>Interior of anal canal</w:t>
+      </w:r>
+    </w:p>
+    <w:p>
+      <w:pPr>
+        <w:pStyle w:val="Heading3"/>
+      </w:pPr>
+      <w:r>
+        <w:t>Anal columns of Morgagni</w:t>
+      </w:r>
+    </w:p>
+    <w:p>
+      <w:r>
+        <w:t xml:space="preserve">Permanent mucosal folds with underlying parallel bundles of muscularis </w:t>
+      </w:r>
+    </w:p>
+    <w:p>
+      <w:pPr>
+        <w:pStyle w:val="Heading3"/>
+      </w:pPr>
+      <w:r>
+        <w:t xml:space="preserve">Anal valves </w:t>
+      </w:r>
+    </w:p>
+    <w:p>
+      <w:r>
+        <w:t>Crescent shaped folds connecting lower ends of anal columns</w:t>
+      </w:r>
+    </w:p>
+    <w:p>
+      <w:r>
+        <w:t>[TIP]</w:t>
+      </w:r>
+      <w:r>
+        <w:t xml:space="preserve">Pectinate line (dentate line) is the position of anal valves </w:t>
+      </w:r>
+    </w:p>
+    <w:p>
+      <w:pPr>
+        <w:pStyle w:val="Heading3"/>
+      </w:pPr>
+      <w:r>
+        <w:t>Anal sinuses or anal crypts</w:t>
+      </w:r>
+    </w:p>
+    <w:p>
+      <w:r>
+        <w:t xml:space="preserve">Pockets formed by the anal valves </w:t>
+      </w:r>
+    </w:p>
+    <w:p>
+      <w:pPr>
+        <w:pStyle w:val="Heading3"/>
+      </w:pPr>
+      <w:r>
+        <w:t xml:space="preserve">Anal ducts </w:t>
+      </w:r>
+    </w:p>
+    <w:p>
+      <w:r>
+        <w:t>Downward and outward running small ducts from anal sinuses on the posterior rectal wall</w:t>
+      </w:r>
+    </w:p>
+    <w:p>
+      <w:pPr>
+        <w:pStyle w:val="Heading3"/>
+      </w:pPr>
+      <w:r>
+        <w:t xml:space="preserve">Anal papillae </w:t>
+      </w:r>
+    </w:p>
+    <w:p>
+      <w:r>
+        <w:t>Mucosal projections from the junction of anal valves and the anal columns</w:t>
+      </w:r>
+    </w:p>
+    <w:p>
+      <w:r>
         <w:t>[HTML]</w:t>
       </w:r>
       <w:r>
-        <w:t xml:space="preserve"> </w:t>
-      </w:r>
-      <w:r>
-        <w:t>femalepelvis.html</w:t>
-      </w:r>
-    </w:p>
-    <w:p>
-      <w:pPr>
-        <w:pStyle w:val="Heading2"/>
-      </w:pPr>
-      <w:r>
-        <w:t>Interior of rectum</w:t>
-      </w:r>
-    </w:p>
-    <w:p>
-      <w:r>
-        <w:t>Four transverse mucosal folds - inconsistent</w:t>
-      </w:r>
-    </w:p>
-    <w:p>
-      <w:r>
-        <w:t>First and third - towards left </w:t>
-      </w:r>
-    </w:p>
-    <w:p>
-      <w:r>
-        <w:t>Second and fourth - towards right </w:t>
-      </w:r>
-    </w:p>
-    <w:p>
-      <w:pPr>
-        <w:pStyle w:val="Heading2"/>
-      </w:pPr>
-      <w:r>
-        <w:t>Surgical anal canal</w:t>
-      </w:r>
-    </w:p>
-    <w:p>
-      <w:r>
-        <w:t>Definition - anal canal + 2 cm of distal rectum above the pectinate line</w:t>
-      </w:r>
-    </w:p>
-    <w:p>
-      <w:pPr>
-        <w:pStyle w:val="Heading2"/>
-      </w:pPr>
-      <w:r>
-        <w:t>Interior of anal canal</w:t>
-      </w:r>
-    </w:p>
-    <w:p>
-      <w:pPr>
-        <w:pStyle w:val="Heading3"/>
-      </w:pPr>
-      <w:r>
-        <w:t>Anal columns of Morgagni</w:t>
-      </w:r>
-    </w:p>
-    <w:p>
-      <w:r>
-        <w:t xml:space="preserve">Permanent mucosal folds with underlying parallel bundles of muscularis </w:t>
-      </w:r>
-    </w:p>
-    <w:p>
-      <w:pPr>
-        <w:pStyle w:val="Heading3"/>
-      </w:pPr>
-      <w:r>
-        <w:t xml:space="preserve">Anal valves </w:t>
-      </w:r>
-    </w:p>
-    <w:p>
-      <w:r>
-        <w:t>Crescent shaped folds connecting lower ends of anal columns</w:t>
-      </w:r>
-    </w:p>
-    <w:p>
-      <w:r>
-        <w:t>[TIP]</w:t>
-      </w:r>
-      <w:r>
-        <w:t xml:space="preserve">Pectinate line (dentate line) is the position of anal valves </w:t>
-      </w:r>
-    </w:p>
-    <w:p>
-      <w:pPr>
-        <w:pStyle w:val="Heading3"/>
-      </w:pPr>
-      <w:r>
-        <w:t>Anal sinuses or anal crypts</w:t>
-      </w:r>
-    </w:p>
-    <w:p>
-      <w:r>
-        <w:t xml:space="preserve">Pockets formed by the anal valves </w:t>
-      </w:r>
-    </w:p>
-    <w:p>
-      <w:pPr>
-        <w:pStyle w:val="Heading3"/>
-      </w:pPr>
-      <w:r>
-        <w:t xml:space="preserve">Anal ducts </w:t>
-      </w:r>
-    </w:p>
-    <w:p>
-      <w:r>
-        <w:t>Downward and outward running small ducts from anal sinuses on the posterior rectal wall</w:t>
-      </w:r>
-    </w:p>
-    <w:p>
-      <w:pPr>
-        <w:pStyle w:val="Heading3"/>
-      </w:pPr>
-      <w:r>
-        <w:t xml:space="preserve">Anal papillae </w:t>
-      </w:r>
-    </w:p>
-    <w:p>
-      <w:r>
-        <w:t>Mucosal projections from the junction of anal valves and the anal columns</w:t>
-      </w:r>
-    </w:p>
-    <w:p>
-      <w:r>
-        <w:t>[HTML]</w:t>
-      </w:r>
-      <w:r>
-        <w:t xml:space="preserve"> </w:t>
-      </w:r>
-      <w:r>
-        <w:t>analinterior.html</w:t>
+        <w:t xml:space="preserve"> analinterior.html</w:t>
       </w:r>
     </w:p>
     <w:p>
@@ -698,10 +709,7 @@
         <w:t>[HTML]</w:t>
       </w:r>
       <w:r>
-        <w:t xml:space="preserve"> </w:t>
-      </w:r>
-      <w:r>
-        <w:t>pectinate1.html</w:t>
+        <w:t xml:space="preserve"> pectinate1.html</w:t>
       </w:r>
     </w:p>
     <w:p>
@@ -780,21 +788,7 @@
               <w:rPr>
                 <w:color w:val="FFC000"/>
               </w:rPr>
-              <w:t xml:space="preserve">Above </w:t>
-            </w:r>
-            <w:proofErr w:type="spellStart"/>
-            <w:r>
-              <w:rPr>
-                <w:color w:val="FFC000"/>
-              </w:rPr>
-              <w:t>pectiate</w:t>
-            </w:r>
-            <w:proofErr w:type="spellEnd"/>
-            <w:r>
-              <w:rPr>
-                <w:color w:val="FFC000"/>
-              </w:rPr>
-              <w:t xml:space="preserve"> line</w:t>
+              <w:t>Above pectiate line</w:t>
             </w:r>
           </w:p>
         </w:tc>
@@ -1108,15 +1102,7 @@
       </w:r>
       <w:r>
         <w:br/>
-        <w:t xml:space="preserve">C. S3 vertebral </w:t>
-      </w:r>
-      <w:proofErr w:type="gramStart"/>
-      <w:r>
-        <w:t>level[</w:t>
-      </w:r>
-      <w:proofErr w:type="gramEnd"/>
-      <w:r>
-        <w:t>CORRECT]</w:t>
+        <w:t>C. S3 vertebral level[CORRECT]</w:t>
       </w:r>
       <w:r>
         <w:br/>
@@ -1142,15 +1128,7 @@
       </w:r>
       <w:r>
         <w:br/>
-        <w:t xml:space="preserve">C. Anal canal plus distal 2 cm of rectum above pectinate </w:t>
-      </w:r>
-      <w:proofErr w:type="gramStart"/>
-      <w:r>
-        <w:t>line[</w:t>
-      </w:r>
-      <w:proofErr w:type="gramEnd"/>
-      <w:r>
-        <w:t>CORRECT]</w:t>
+        <w:t>C. Anal canal plus distal 2 cm of rectum above pectinate line[CORRECT]</w:t>
       </w:r>
       <w:r>
         <w:br/>
@@ -1173,15 +1151,7 @@
       </w:r>
       <w:r>
         <w:br/>
-        <w:t xml:space="preserve">B. Convex anteriorly due to </w:t>
-      </w:r>
-      <w:proofErr w:type="gramStart"/>
-      <w:r>
-        <w:t>puborectalis[</w:t>
-      </w:r>
-      <w:proofErr w:type="gramEnd"/>
-      <w:r>
-        <w:t>CORRECT]</w:t>
+        <w:t>B. Convex anteriorly due to puborectalis[CORRECT]</w:t>
       </w:r>
       <w:r>
         <w:br/>
@@ -1211,15 +1181,7 @@
       </w:r>
       <w:r>
         <w:br/>
-        <w:t xml:space="preserve">C. Anal </w:t>
-      </w:r>
-      <w:proofErr w:type="gramStart"/>
-      <w:r>
-        <w:t>valves[</w:t>
-      </w:r>
-      <w:proofErr w:type="gramEnd"/>
-      <w:r>
-        <w:t>CORRECT]</w:t>
+        <w:t>C. Anal valves[CORRECT]</w:t>
       </w:r>
       <w:r>
         <w:br/>
@@ -1245,15 +1207,7 @@
       </w:r>
       <w:r>
         <w:br/>
-        <w:t xml:space="preserve">C. Stratified </w:t>
-      </w:r>
-      <w:proofErr w:type="gramStart"/>
-      <w:r>
-        <w:t>squamous[</w:t>
-      </w:r>
-      <w:proofErr w:type="gramEnd"/>
-      <w:r>
-        <w:t>CORRECT]</w:t>
+        <w:t>C. Stratified squamous[CORRECT]</w:t>
       </w:r>
       <w:r>
         <w:br/>
@@ -1275,15 +1229,7 @@
       </w:r>
       <w:r>
         <w:br/>
-        <w:t xml:space="preserve">B. Above pectinate </w:t>
-      </w:r>
-      <w:proofErr w:type="gramStart"/>
-      <w:r>
-        <w:t>line[</w:t>
-      </w:r>
-      <w:proofErr w:type="gramEnd"/>
-      <w:r>
-        <w:t>CORRECT]</w:t>
+        <w:t>B. Above pectinate line[CORRECT]</w:t>
       </w:r>
       <w:r>
         <w:br/>
@@ -1296,10 +1242,7 @@
     </w:p>
     <w:p>
       <w:r>
-        <w:t>____</w:t>
-      </w:r>
-      <w:r>
-        <w:t>MCQ_END____</w:t>
+        <w:t>____MCQ_END____</w:t>
       </w:r>
     </w:p>
     <w:p/>
@@ -3287,6 +3230,7 @@
   <w:style w:type="character" w:default="1" w:styleId="DefaultParagraphFont">
     <w:name w:val="Default Paragraph Font"/>
     <w:uiPriority w:val="1"/>
+    <w:semiHidden/>
     <w:unhideWhenUsed/>
   </w:style>
   <w:style w:type="table" w:default="1" w:styleId="TableNormal">

</xml_diff>